<commit_message>
Use the measured 4.17 s per reply in the operating-cost section
Co-Authored-By: Claude Opus 5 (1M context) <noreply@anthropic.com>
</commit_message>
<xml_diff>
--- a/writing/Chapter 3 - 3.8 Economic Analysis/FINAL_TEXT.docx
+++ b/writing/Chapter 3 - 3.8 Economic Analysis/FINAL_TEXT.docx
@@ -1677,17 +1677,14 @@
         <w:t>[[TEAM TO FILL: current published price per million input and output tokens for a named commercial model, with the date checked]]</w:t>
       </w:r>
       <w:r>
-        <w:t xml:space="preserve">. A free CPU host with 2 virtual CPUs and 16 GB of memory costs nothing but responds considerably more slowly, </w:t>
+        <w:t xml:space="preserve">. A free CPU host with 2 virtual CPUs and 16 GB of memory costs nothing but would respond considerably more slowly than the 4.17 seconds per reply measured on the project's GPU (Section 5.4.7); latency on such a host was not measured. </w:t>
       </w:r>
       <w:r>
         <w:rPr>
           <w:b/>
           <w:color w:val="B03A00"/>
         </w:rPr>
-        <w:t>[[TEAM TO FILL: measured response time if the demonstration is deployed; otherwise state that latency was not measured]]</w:t>
-      </w:r>
-      <w:r>
-        <w:t>.</w:t>
+        <w:t>[[TEAM TO FILL: if the demonstration is deployed, add its measured response time.]]</w:t>
       </w:r>
     </w:p>
     <w:p>

</xml_diff>